<commit_message>
v2.0.0 Session 1: CPT, admin menu, type chooser
</commit_message>
<xml_diff>
--- a/KDNA_Tables_v2.0_Project_Brief.docx
+++ b/KDNA_Tables_v2.0_Project_Brief.docx
@@ -6747,7 +6747,7 @@
           <w:iCs w:val="false"/>
           <w:color w:val="000000"/>
         </w:rPr>
-        <w:t xml:space="preserve">Overall Status: Not started</w:t>
+        <w:t>Overall Status: Session 1 complete</w:t>
       </w:r>
     </w:p>
     <w:p>
@@ -6762,7 +6762,7 @@
           <w:iCs w:val="false"/>
           <w:color w:val="000000"/>
         </w:rPr>
-        <w:t xml:space="preserve">Next Session: 1</w:t>
+        <w:t>Next Session: 2</w:t>
       </w:r>
     </w:p>
     <w:p>
@@ -6978,7 +6978,7 @@
                 <w:sz w:val="20"/>
                 <w:szCs w:val="20"/>
               </w:rPr>
-              <w:t xml:space="preserve">Not started</w:t>
+              <w:t>Complete</w:t>
             </w:r>
           </w:p>
         </w:tc>
@@ -7036,7 +7036,7 @@
                 <w:sz w:val="20"/>
                 <w:szCs w:val="20"/>
               </w:rPr>
-              <w:t xml:space="preserve"/>
+              <w:t>CPT registered, top-level admin menu and submenus added, Type Chooser screen routes Add New, list table customised with Type/Rows-Items/Feature rows/Shortcode columns, Duplicate row action implemented.</w:t>
             </w:r>
           </w:p>
         </w:tc>
@@ -7659,7 +7659,7 @@
           <w:iCs w:val="false"/>
           <w:color w:val="000000"/>
         </w:rPr>
-        <w:t xml:space="preserve">Deviations from brief:</w:t>
+        <w:t>Deviations from brief:</w:t>
       </w:r>
     </w:p>
     <w:p>
@@ -7674,7 +7674,7 @@
           <w:iCs w:val="false"/>
           <w:color w:val="000000"/>
         </w:rPr>
-        <w:t xml:space="preserve">(none yet)</w:t>
+        <w:t>Brief filename in repo is KDNA_Tables_v2.0_Project_Brief.docx (prompt references PROJECT_BRIEF_v2.docx). Treated as the same document.</w:t>
       </w:r>
     </w:p>
     <w:p>

</xml_diff>

<commit_message>
v2.0.0 Session 2: widget refactor + data layer
</commit_message>
<xml_diff>
--- a/KDNA_Tables_v2.0_Project_Brief.docx
+++ b/KDNA_Tables_v2.0_Project_Brief.docx
@@ -6747,7 +6747,7 @@
           <w:iCs w:val="false"/>
           <w:color w:val="000000"/>
         </w:rPr>
-        <w:t>Overall Status: Session 1 complete</w:t>
+        <w:t>Overall Status: Session 2 complete</w:t>
       </w:r>
     </w:p>
     <w:p>
@@ -6762,7 +6762,7 @@
           <w:iCs w:val="false"/>
           <w:color w:val="000000"/>
         </w:rPr>
-        <w:t>Next Session: 2</w:t>
+        <w:t>Next Session: 3</w:t>
       </w:r>
     </w:p>
     <w:p>
@@ -7096,7 +7096,7 @@
                 <w:sz w:val="20"/>
                 <w:szCs w:val="20"/>
               </w:rPr>
-              <w:t xml:space="preserve">Not started</w:t>
+              <w:t>Complete</w:t>
             </w:r>
           </w:p>
         </w:tc>
@@ -7154,7 +7154,7 @@
                 <w:sz w:val="20"/>
                 <w:szCs w:val="20"/>
               </w:rPr>
-              <w:t xml:space="preserve"/>
+              <w:t>Widget refactored: 7 data Content sections removed (Table Type, Table, Columns, Rows, Compared Items, Highlighted Item, Feature Rows). Source Table dropdown and hidden selected_table_type mirror added. All Style/Cell-Indicator conditions swapped to selected_table_type; cross-cutting Sticky/Responsive conditions swapped to selected_table_id. KDNA_Tables_Data::get_settings_for_render() maps CPT meta into the legacy $settings shape so render-general.php and render-comparison.php remain untouched. get_style_depends() now reads CPT type for the comparison stylesheet, responsive stylesheet gated on responsive_mode. Editor JS subscribes to selected_table_id, AJAX-fetches type from new kdna_tables_get_table_type endpoint, writes to selected_table_type so Style sections re-evaluate. Widget shrunk from 3940 to 3094 lines (124K to 98K, ~21%).</w:t>
             </w:r>
           </w:p>
         </w:tc>
@@ -7674,7 +7674,7 @@
           <w:iCs w:val="false"/>
           <w:color w:val="000000"/>
         </w:rPr>
-        <w:t>Brief filename in repo is KDNA_Tables_v2.0_Project_Brief.docx (prompt references PROJECT_BRIEF_v2.docx). Treated as the same document.</w:t>
+        <w:t>Brief filename in repo is KDNA_Tables_v2.0_Project_Brief.docx (prompt references PROJECT_BRIEF_v2.docx), treated as the same document. Session 2: file shrunk from 124K to 98K bytes (~21%), short of the 50%+ target stated in the acceptance checklist. The Style sections account for most of the bulk and the brief locks them as preserved bit-for-bit, so deeper trimming would require relaxing that constraint.</w:t>
       </w:r>
     </w:p>
     <w:p>

</xml_diff>

<commit_message>
v2.0.0 Session 3: Alpine admin editor for general tables
</commit_message>
<xml_diff>
--- a/KDNA_Tables_v2.0_Project_Brief.docx
+++ b/KDNA_Tables_v2.0_Project_Brief.docx
@@ -6747,7 +6747,7 @@
           <w:iCs w:val="false"/>
           <w:color w:val="000000"/>
         </w:rPr>
-        <w:t>Overall Status: Session 2 complete</w:t>
+        <w:t>Overall Status: Session 3 complete</w:t>
       </w:r>
     </w:p>
     <w:p>
@@ -6762,7 +6762,7 @@
           <w:iCs w:val="false"/>
           <w:color w:val="000000"/>
         </w:rPr>
-        <w:t>Next Session: 3</w:t>
+        <w:t>Next Session: 4</w:t>
       </w:r>
     </w:p>
     <w:p>
@@ -7214,7 +7214,7 @@
                 <w:sz w:val="20"/>
                 <w:szCs w:val="20"/>
               </w:rPr>
-              <w:t xml:space="preserve">Not started</w:t>
+              <w:t>Complete</w:t>
             </w:r>
           </w:p>
         </w:tc>
@@ -7272,7 +7272,7 @@
                 <w:sz w:val="20"/>
                 <w:szCs w:val="20"/>
               </w:rPr>
-              <w:t xml:space="preserve"/>
+              <w:t>Alpine.js 3.15.12 bundled locally as assets/js/alpine.min.js. KDNA_Tables_Editor class swaps the standard post edit screen for an Alpine matrix editor: kdna_tables_editor meta box (normal/high), Shortcode side meta box with copy button, default meta boxes stripped (slug, author, comments, postcustom, revisions, trackbacks), Publish kept. State injected as window.kdnaTablesInitialState (snake_case throughout, matches CPT meta keys). templates/admin-editor-general.php renders the CSS Grid matrix: caption input, first-row/first-column header switchers, column header row with label input + alignment + width + move + delete toolbar, body rows with row label + move + delete toolbar, contenteditable plain-text cells with per-cell alignment toolbar on focus, +Column (max 10) and +Row buttons. assets/js/kdna-admin.js exposes Alpine factory kdnaTablesGeneralEditor() with addColumn/removeColumn/moveColumn/addRow/removeRow/moveRow/setColumnAlignment/setColumnWidth/setAlignment/setCellText methods; $watch on state with 300ms debounce writes JSON to hidden input kdna_tables_editor_state, flushed on form submit. Save handler verifies nonce + cap, routes general state through KDNA_Tables_CPT::sanitize_table_data() which pads short rows and truncates long ones to match column count, splits caption to _kdna_table_caption, body to _kdna_table_general, bumps _kdna_table_schema_version. Comparison-type screen renders a Coming in Session 5 placeholder.</w:t>
             </w:r>
           </w:p>
         </w:tc>
@@ -7674,7 +7674,7 @@
           <w:iCs w:val="false"/>
           <w:color w:val="000000"/>
         </w:rPr>
-        <w:t>Brief filename in repo is KDNA_Tables_v2.0_Project_Brief.docx (prompt references PROJECT_BRIEF_v2.docx), treated as the same document. Session 2: file shrunk from 124K to 98K bytes (~21%), short of the 50%+ target stated in the acceptance checklist. The Style sections account for most of the bulk and the brief locks them as preserved bit-for-bit, so deeper trimming would require relaxing that constraint.</w:t>
+        <w:t>Brief filename in repo is KDNA_Tables_v2.0_Project_Brief.docx (prompt references PROJECT_BRIEF_v2.docx), treated as the same document. Session 2: widget shrunk 124K -&gt; 98K (~21%), short of the 50%+ acceptance target. Style sections (preserved bit-for-bit per locked decision) dominate file bulk. Session 3: Alpine editor state and CPT meta both use snake_case keys end-to-end (the brief Section 6.3 example used camelCase). One uniform shape removes a translation hop on save and load, no functional impact. Session 3: bundled Alpine 3.15.12 from npm (official release, 46K min), brief estimated ~15K; the official v3 cdn build is larger now. Session 3: kdna-admin.js is enqueued as a dependency of alpine.min.js (reverse of intuitive direction) so admin.js executes first and registers the Alpine factory + alpine:init listener before Alpine boots in the footer.</w:t>
       </w:r>
     </w:p>
     <w:p>

</xml_diff>

<commit_message>
v2.0.0 Session 4: rich cell editors for general tables
</commit_message>
<xml_diff>
--- a/KDNA_Tables_v2.0_Project_Brief.docx
+++ b/KDNA_Tables_v2.0_Project_Brief.docx
@@ -6747,7 +6747,7 @@
           <w:iCs w:val="false"/>
           <w:color w:val="000000"/>
         </w:rPr>
-        <w:t>Overall Status: Session 3 complete</w:t>
+        <w:t>Overall Status: Session 4 complete</w:t>
       </w:r>
     </w:p>
     <w:p>
@@ -6762,7 +6762,7 @@
           <w:iCs w:val="false"/>
           <w:color w:val="000000"/>
         </w:rPr>
-        <w:t>Next Session: 4</w:t>
+        <w:t>Next Session: 5</w:t>
       </w:r>
     </w:p>
     <w:p>
@@ -7332,7 +7332,7 @@
                 <w:sz w:val="20"/>
                 <w:szCs w:val="20"/>
               </w:rPr>
-              <w:t xml:space="preserve">Not started</w:t>
+              <w:t>Complete</w:t>
             </w:r>
           </w:p>
         </w:tc>
@@ -7390,7 +7390,7 @@
                 <w:sz w:val="20"/>
                 <w:szCs w:val="20"/>
               </w:rPr>
-              <w:t xml:space="preserve"/>
+              <w:t>General editor extended with rich cell content. Curated kdna-icons.json (181 icons across FA6 solid/regular/brands and Elementor eicon). Icon picker modal opens from per-cell toolbar with searchable name/keyword/class filter and library scope. Image picker bridges wp.media() via wp_enqueue_media in the editor class. Cell preview renders icon + text + image via CSS-order so arrangement changes do not unmount the contenteditable. Arrangement dropdown appears only when &gt;=2 content types; options generated from sorted types. Per-piece remove buttons clear icon/image and prune content_types. Column toolbar gained a width unit selector (% / px) with auto-clamp on switch. CPT VALID_ARRANGEMENTS expanded to all 12 permutations (6 two-piece + 6 three-piece). Data layer resolve_legacy_arrangement collapses modern arrangements onto the 4-value legacy set the locked render template understands, and px column widths gracefully fall back to size=0 (auto column) because render-general.php hardcodes the % CSS unit.</w:t>
             </w:r>
           </w:p>
         </w:tc>
@@ -7674,7 +7674,7 @@
           <w:iCs w:val="false"/>
           <w:color w:val="000000"/>
         </w:rPr>
-        <w:t>Brief filename in repo is KDNA_Tables_v2.0_Project_Brief.docx (prompt references PROJECT_BRIEF_v2.docx), treated as the same document. Session 2: widget shrunk 124K -&gt; 98K (~21%), short of the 50%+ acceptance target. Style sections (preserved bit-for-bit per locked decision) dominate file bulk. Session 3: Alpine editor state and CPT meta both use snake_case keys end-to-end (the brief Section 6.3 example used camelCase). One uniform shape removes a translation hop on save and load, no functional impact. Session 3: bundled Alpine 3.15.12 from npm (official release, 46K min), brief estimated ~15K; the official v3 cdn build is larger now. Session 3: kdna-admin.js is enqueued as a dependency of alpine.min.js (reverse of intuitive direction) so admin.js executes first and registers the Alpine factory + alpine:init listener before Alpine boots in the footer.</w:t>
+        <w:t>Brief filename in repo is KDNA_Tables_v2.0_Project_Brief.docx (prompt references PROJECT_BRIEF_v2.docx), treated as the same document. Session 2: widget shrunk 124K -&gt; 98K (~21%), short of the 50%+ acceptance target. Style sections dominate file bulk and are locked. Session 3: Alpine editor state and CPT meta both use snake_case keys end-to-end (brief Section 6.3 sample used camelCase). Session 3: bundled Alpine 3.15.12 (46K min). Brief estimated ~15K. Session 3: kdna-admin.js is enqueued as a dependency of alpine.min.js so admin.js runs first and registers the Alpine factory + alpine:init listener before Alpine boots in the footer. Session 4: icon set is a curated 181 icons (152 FA6 free + 24 Elementor eicon). Brief left the size unspecified beyond "slim". Session 4: render-general.php still hardcodes the % unit in the column CSS, so px-unit columns fall back to auto-sized via data layer (size=0 emitted, unit preserved in meta). Full px support needs a 1-line template change which is out of Session 4 scope. Session 4: the legacy renderer kdna_render_cell_inner supports four arrangement values (icon-text, text-icon, icon-text-image, image-text-icon). The data layer collapses the modern 10-arrangement set onto these four by picking the closest legacy arrangement and relying on the legacy piece renderers returning empty strings for absent pieces.</w:t>
       </w:r>
     </w:p>
     <w:p>

</xml_diff>

<commit_message>
v2.0.0 Session 5: comparison table admin editor
</commit_message>
<xml_diff>
--- a/KDNA_Tables_v2.0_Project_Brief.docx
+++ b/KDNA_Tables_v2.0_Project_Brief.docx
@@ -6747,7 +6747,7 @@
           <w:iCs w:val="false"/>
           <w:color w:val="000000"/>
         </w:rPr>
-        <w:t>Overall Status: Session 4 complete</w:t>
+        <w:t>Overall Status: Session 5 complete</w:t>
       </w:r>
     </w:p>
     <w:p>
@@ -6762,7 +6762,7 @@
           <w:iCs w:val="false"/>
           <w:color w:val="000000"/>
         </w:rPr>
-        <w:t>Next Session: 5</w:t>
+        <w:t>Next Session: 6</w:t>
       </w:r>
     </w:p>
     <w:p>
@@ -7450,7 +7450,7 @@
                 <w:sz w:val="20"/>
                 <w:szCs w:val="20"/>
               </w:rPr>
-              <w:t xml:space="preserve">Not started</w:t>
+              <w:t>Complete</w:t>
             </w:r>
           </w:p>
         </w:tc>
@@ -7508,7 +7508,7 @@
                 <w:sz w:val="20"/>
                 <w:szCs w:val="20"/>
               </w:rPr>
-              <w:t xml:space="preserve"/>
+              <w:t>Comparison editor built. templates/admin-editor-comparison.php replaces the Session 3 placeholder with an Alpine editor: caption input, items strip (image picker via wp.media, label, sublabel, CTA toggle + text/url, highlight radio with toggle-off, move-left/right, delete), inline badge controls (text + position) shown only when an item is highlighted, +Item capped at 6, then a feature-rows section using a CSS Grid (minmax(220px,1fr) + repeat(--kdna-items)). Each feature row has label/description/tooltip textareas plus a per-cell three-state picker (tick/cross/pencil). Custom cells expand a sub-editor mirroring Session 4 (text contenteditable, icon picker modal, wp.media image picker, arrangement select). Reordering an item also reorders cells in every feature row in lockstep, and the highlight index travels with the item. Deleting an item shifts the highlight index down or clears it when the deleted item was highlighted. kdna-admin.js refactored to share helpers (uid, arrangement, icon catalogue loader, wp.media bridge, form-flush) between the two Alpine factories. KDNA_Tables_Editor::save_post extended: when type is comparison, decode -&gt; KDNA_Tables_CPT::sanitize_table_data($body, "comparison") -&gt; _kdna_table_comparison; caption goes to _kdna_table_caption; schema version bumped. Widget render path (Session 2 data layer) already covers comparison; full round-trip smoke test passes: items, image attachments, CTA fields, highlight index -&gt; legacy slot mapping, badge text/position, feature rows with label/description/tooltip, per-cell available/unavailable/custom -&gt; cell_N_indicator with custom_type/text/icon/image/arrangement, plus widget Cell Indicators (available_icon, unavailable_mode/icon, tooltip_position) merged from widget settings.</w:t>
             </w:r>
           </w:p>
         </w:tc>

</xml_diff>

<commit_message>
v2.0.0 Session 6: migration, shortcode, polish, RELEASE
</commit_message>
<xml_diff>
--- a/KDNA_Tables_v2.0_Project_Brief.docx
+++ b/KDNA_Tables_v2.0_Project_Brief.docx
@@ -6747,7 +6747,7 @@
           <w:iCs w:val="false"/>
           <w:color w:val="000000"/>
         </w:rPr>
-        <w:t>Overall Status: Session 5 complete</w:t>
+        <w:t>Overall Status: RELEASED (v2.0.0)</w:t>
       </w:r>
     </w:p>
     <w:p>
@@ -6762,7 +6762,7 @@
           <w:iCs w:val="false"/>
           <w:color w:val="000000"/>
         </w:rPr>
-        <w:t>Next Session: 6</w:t>
+        <w:t>Next Session: (none)</w:t>
       </w:r>
     </w:p>
     <w:p>
@@ -7568,7 +7568,7 @@
                 <w:sz w:val="20"/>
                 <w:szCs w:val="20"/>
               </w:rPr>
-              <w:t xml:space="preserve">Not started</w:t>
+              <w:t>Complete</w:t>
             </w:r>
           </w:p>
         </w:tc>
@@ -7626,7 +7626,7 @@
                 <w:sz w:val="20"/>
                 <w:szCs w:val="20"/>
               </w:rPr>
-              <w:t xml:space="preserve"/>
+              <w:t>Session 6 wraps v2.0.0. Migration class (includes/class-kdna-tables-migration.php) provides lazy in-editor migration (AJAX endpoint kdna_tables_migrate_instance maps legacy widget settings to CPT shape via legacy_to_general / legacy_to_comparison, runs through CPT sanitiser, dedupes via content-hash that strips repeater IDs) and a bulk Tools page (scan + 10-post chunked migrate with backup to _kdna_tables_pre_migration_backup, JSON log download, per-post rollback button). Editor JS detects legacy data on widget panel open, shows a yellow migrate notice with button that POSTs the legacy payload, clears the legacy keys, sets selected_table_id, marks the page dirty. Shortcode class registers [kdna_table id="123"] for non-Elementor contexts, renders via the existing render templates with default display settings and lazily-enqueued frontend CSS, returns empty on invalid/unpublished id. Structural preview meta box mounts below the editor meta box, listens for kdna:state CustomEvent dispatched from each editor on every state change, renders a plain HTML table (minimal inline CSS) live as the user edits. Inline help (?) tooltips added to First row is header, First column is header, Highlight item, Tooltip text controls. Used in list table column added with 5-minute transient cache, flushed on save_post and deleted_post. README rewritten for v2.0.0 with Workflow, Shortcode, Migration from v1.x sections and a full v2.0.0 changelog entry. Tools submenu gated on manage_options; All Tables/Add New still edit_posts. Full round-trip smoke test confirms legacy v1.x general and comparison payloads migrate correctly, content-hash dedupe reuses the same CPT entry on repeat migration, prior session smoke tests still pass. v2.0.0 tagged.</w:t>
             </w:r>
           </w:p>
         </w:tc>

</xml_diff>